<commit_message>
fix diagram label that GitHub's Mermaid could not parse
Co-Authored-By: Claude Fable 5.1 <noreply@anthropic.com>
</commit_message>
<xml_diff>
--- a/feedback/Josh-Caili-Banhmigos-Project-1-Feedback.docx
+++ b/feedback/Josh-Caili-Banhmigos-Project-1-Feedback.docx
@@ -74,7 +74,7 @@
         </w:rPr>
         <w:t xml:space="preserve">Repo: </w:t>
       </w:r>
-      <w:hyperlink w:history="1" r:id="rIdhoakoflppvspdnhdfzi05">
+      <w:hyperlink w:history="1" r:id="rIdmilgy0mi1ufvfr_6of-ik">
         <w:r>
           <w:rPr>
             <w:rStyle w:val="Hyperlink"/>
@@ -92,7 +92,7 @@
         </w:rPr>
         <w:t xml:space="preserve">Live: </w:t>
       </w:r>
-      <w:hyperlink w:history="1" r:id="rIdshxoxda1vd03hwog-63ai">
+      <w:hyperlink w:history="1" r:id="rIdowlkwoerybsul4v8rpgvr">
         <w:r>
           <w:rPr>
             <w:rStyle w:val="Hyperlink"/>

</xml_diff>